<commit_message>
parent k hiện first name
</commit_message>
<xml_diff>
--- a/AngularTutorial.docx
+++ b/AngularTutorial.docx
@@ -14,21 +14,12 @@
           <w:bCs/>
         </w:rPr>
       </w:pPr>
-      <w:proofErr w:type="spellStart"/>
       <w:r>
         <w:rPr>
           <w:b/>
           <w:bCs/>
         </w:rPr>
-        <w:t>Mở</w:t>
-      </w:r>
-      <w:proofErr w:type="spellEnd"/>
-      <w:r>
-        <w:rPr>
-          <w:b/>
-          <w:bCs/>
-        </w:rPr>
-        <w:t xml:space="preserve"> Terminal</w:t>
+        <w:t>Mở Terminal</w:t>
       </w:r>
     </w:p>
     <w:p>
@@ -93,104 +84,76 @@
           <w:bCs/>
         </w:rPr>
       </w:pPr>
-      <w:proofErr w:type="spellStart"/>
       <w:r>
         <w:rPr>
           <w:b/>
           <w:bCs/>
         </w:rPr>
-        <w:t>Tạo</w:t>
-      </w:r>
-      <w:proofErr w:type="spellEnd"/>
-      <w:r>
+        <w:t>Tạo Component</w:t>
+      </w:r>
+    </w:p>
+    <w:p>
+      <w:r>
+        <w:t xml:space="preserve">Di chuyển tới thư mục chứa component: </w:t>
+      </w:r>
+      <w:r>
+        <w:rPr>
+          <w:highlight w:val="yellow"/>
+        </w:rPr>
+        <w:t>cd GUI/src/app/pages/</w:t>
+      </w:r>
+      <w:r>
+        <w:rPr>
+          <w:highlight w:val="yellow"/>
+        </w:rPr>
+        <w:t>management</w:t>
+      </w:r>
+    </w:p>
+    <w:p>
+      <w:pPr>
         <w:rPr>
           <w:b/>
           <w:bCs/>
         </w:rPr>
-        <w:t xml:space="preserve"> Component</w:t>
-      </w:r>
-    </w:p>
-    <w:p>
-      <w:r>
-        <w:t xml:space="preserve">Di </w:t>
-      </w:r>
-      <w:proofErr w:type="spellStart"/>
-      <w:r>
-        <w:t>chuyển</w:t>
-      </w:r>
-      <w:proofErr w:type="spellEnd"/>
-      <w:r>
-        <w:t xml:space="preserve"> </w:t>
-      </w:r>
-      <w:proofErr w:type="spellStart"/>
-      <w:r>
-        <w:t>tới</w:t>
-      </w:r>
-      <w:proofErr w:type="spellEnd"/>
-      <w:r>
-        <w:t xml:space="preserve"> </w:t>
-      </w:r>
-      <w:proofErr w:type="spellStart"/>
-      <w:r>
-        <w:t>thư</w:t>
-      </w:r>
-      <w:proofErr w:type="spellEnd"/>
-      <w:r>
-        <w:t xml:space="preserve"> </w:t>
-      </w:r>
-      <w:proofErr w:type="spellStart"/>
-      <w:r>
-        <w:t>mục</w:t>
-      </w:r>
-      <w:proofErr w:type="spellEnd"/>
-      <w:r>
-        <w:t xml:space="preserve"> </w:t>
-      </w:r>
-      <w:proofErr w:type="spellStart"/>
-      <w:r>
-        <w:t>chứa</w:t>
-      </w:r>
-      <w:proofErr w:type="spellEnd"/>
-      <w:r>
-        <w:t xml:space="preserve"> component: </w:t>
-      </w:r>
-      <w:r>
-        <w:t>cd GUI/</w:t>
-      </w:r>
-      <w:proofErr w:type="spellStart"/>
-      <w:r>
-        <w:t>src</w:t>
-      </w:r>
-      <w:proofErr w:type="spellEnd"/>
-      <w:r>
-        <w:t>/app/pages/</w:t>
-      </w:r>
-      <w:r>
-        <w:t>training</w:t>
-      </w:r>
-    </w:p>
-    <w:p>
-      <w:pPr>
+      </w:pPr>
+      <w:r>
+        <w:t xml:space="preserve">Câu lệnh: </w:t>
+      </w:r>
+      <w:r>
         <w:rPr>
           <w:b/>
           <w:bCs/>
-        </w:rPr>
-      </w:pPr>
-      <w:proofErr w:type="spellStart"/>
-      <w:r>
-        <w:t>Câu</w:t>
-      </w:r>
-      <w:proofErr w:type="spellEnd"/>
-      <w:r>
+          <w:highlight w:val="yellow"/>
+        </w:rPr>
+        <w:t>ng g c &lt;&lt;componentName&gt;&gt; --skip-tests</w:t>
+      </w:r>
+    </w:p>
+    <w:p>
+      <w:r>
+        <w:t>Câu lệnh đầy đủ: ng generate component &lt;&lt;componentName&gt;&gt; --skip-tests</w:t>
+      </w:r>
+    </w:p>
+    <w:p>
+      <w:r>
+        <w:t xml:space="preserve">Ví dụ: </w:t>
+      </w:r>
+      <w:r>
+        <w:rPr>
+          <w:highlight w:val="yellow"/>
+        </w:rPr>
+        <w:t xml:space="preserve">ng g c </w:t>
+      </w:r>
+      <w:r>
+        <w:rPr>
+          <w:highlight w:val="yellow"/>
+        </w:rPr>
+        <w:t>parent</w:t>
+      </w:r>
+      <w:r>
+        <w:rPr>
+          <w:highlight w:val="yellow"/>
+        </w:rPr>
         <w:t xml:space="preserve"> </w:t>
-      </w:r>
-      <w:proofErr w:type="spellStart"/>
-      <w:r>
-        <w:t>lệnh</w:t>
-      </w:r>
-      <w:proofErr w:type="spellEnd"/>
-      <w:r>
-        <w:t xml:space="preserve">: </w:t>
       </w:r>
       <w:r>
         <w:rPr>
@@ -198,120 +161,18 @@
           <w:bCs/>
           <w:highlight w:val="yellow"/>
         </w:rPr>
-        <w:t>ng g c &lt;&lt;</w:t>
-      </w:r>
-      <w:proofErr w:type="spellStart"/>
-      <w:r>
-        <w:rPr>
-          <w:b/>
-          <w:bCs/>
-          <w:highlight w:val="yellow"/>
-        </w:rPr>
-        <w:t>componentName</w:t>
-      </w:r>
-      <w:proofErr w:type="spellEnd"/>
-      <w:r>
-        <w:rPr>
-          <w:b/>
-          <w:bCs/>
-          <w:highlight w:val="yellow"/>
-        </w:rPr>
-        <w:t>&gt;&gt; --skip-tests</w:t>
-      </w:r>
-    </w:p>
-    <w:p>
-      <w:proofErr w:type="spellStart"/>
-      <w:r>
-        <w:t>Câu</w:t>
-      </w:r>
-      <w:proofErr w:type="spellEnd"/>
-      <w:r>
-        <w:t xml:space="preserve"> </w:t>
-      </w:r>
-      <w:proofErr w:type="spellStart"/>
-      <w:r>
-        <w:t>lệnh</w:t>
-      </w:r>
-      <w:proofErr w:type="spellEnd"/>
-      <w:r>
-        <w:t xml:space="preserve"> </w:t>
-      </w:r>
-      <w:proofErr w:type="spellStart"/>
-      <w:r>
-        <w:t>đầy</w:t>
-      </w:r>
-      <w:proofErr w:type="spellEnd"/>
-      <w:r>
-        <w:t xml:space="preserve"> </w:t>
-      </w:r>
-      <w:proofErr w:type="spellStart"/>
-      <w:r>
-        <w:t>đủ</w:t>
-      </w:r>
-      <w:proofErr w:type="spellEnd"/>
-      <w:r>
-        <w:t>: ng generate component &lt;&lt;</w:t>
-      </w:r>
-      <w:proofErr w:type="spellStart"/>
-      <w:r>
-        <w:t>componentName</w:t>
-      </w:r>
-      <w:proofErr w:type="spellEnd"/>
-      <w:r>
-        <w:t>&gt;&gt; --skip-tests</w:t>
-      </w:r>
-    </w:p>
-    <w:p>
-      <w:proofErr w:type="spellStart"/>
-      <w:r>
-        <w:t>Ví</w:t>
-      </w:r>
-      <w:proofErr w:type="spellEnd"/>
-      <w:r>
-        <w:t xml:space="preserve"> </w:t>
-      </w:r>
-      <w:proofErr w:type="spellStart"/>
-      <w:r>
-        <w:t>dụ</w:t>
-      </w:r>
-      <w:proofErr w:type="spellEnd"/>
-      <w:r>
-        <w:t xml:space="preserve">: ng g c </w:t>
-      </w:r>
-      <w:r>
-        <w:t>course</w:t>
-      </w:r>
-      <w:r>
-        <w:t xml:space="preserve"> </w:t>
-      </w:r>
-      <w:r>
-        <w:rPr>
-          <w:b/>
-          <w:bCs/>
-          <w:highlight w:val="yellow"/>
-        </w:rPr>
         <w:t>--</w:t>
       </w:r>
       <w:r>
+        <w:rPr>
+          <w:highlight w:val="yellow"/>
+        </w:rPr>
         <w:t>skip-tests</w:t>
       </w:r>
     </w:p>
     <w:p>
-      <w:proofErr w:type="spellStart"/>
-      <w:r>
-        <w:t>Giải</w:t>
-      </w:r>
-      <w:proofErr w:type="spellEnd"/>
-      <w:r>
-        <w:t xml:space="preserve"> </w:t>
-      </w:r>
-      <w:proofErr w:type="spellStart"/>
-      <w:r>
-        <w:t>thích</w:t>
-      </w:r>
-      <w:proofErr w:type="spellEnd"/>
-      <w:r>
-        <w:t>:</w:t>
+      <w:r>
+        <w:t>Giải thích:</w:t>
       </w:r>
     </w:p>
     <w:p>
@@ -323,39 +184,7 @@
         </w:numPr>
       </w:pPr>
       <w:r>
-        <w:t xml:space="preserve">ng: </w:t>
-      </w:r>
-      <w:proofErr w:type="spellStart"/>
-      <w:r>
-        <w:t>câu</w:t>
-      </w:r>
-      <w:proofErr w:type="spellEnd"/>
-      <w:r>
-        <w:t xml:space="preserve"> </w:t>
-      </w:r>
-      <w:proofErr w:type="spellStart"/>
-      <w:r>
-        <w:t>lệnh</w:t>
-      </w:r>
-      <w:proofErr w:type="spellEnd"/>
-      <w:r>
-        <w:t xml:space="preserve"> </w:t>
-      </w:r>
-      <w:proofErr w:type="spellStart"/>
-      <w:r>
-        <w:t>gọi</w:t>
-      </w:r>
-      <w:proofErr w:type="spellEnd"/>
-      <w:r>
-        <w:t xml:space="preserve"> </w:t>
-      </w:r>
-      <w:proofErr w:type="spellStart"/>
-      <w:r>
-        <w:t>đến</w:t>
-      </w:r>
-      <w:proofErr w:type="spellEnd"/>
-      <w:r>
-        <w:t xml:space="preserve"> Angular</w:t>
+        <w:t>ng: câu lệnh gọi đến Angular</w:t>
       </w:r>
     </w:p>
     <w:p>
@@ -367,53 +196,8 @@
         </w:numPr>
       </w:pPr>
       <w:r>
-        <w:t xml:space="preserve">g: </w:t>
-      </w:r>
-      <w:proofErr w:type="spellStart"/>
-      <w:r>
-        <w:t>viết</w:t>
-      </w:r>
-      <w:proofErr w:type="spellEnd"/>
-      <w:r>
-        <w:t xml:space="preserve"> </w:t>
-      </w:r>
-      <w:proofErr w:type="spellStart"/>
-      <w:r>
-        <w:t>tắt</w:t>
-      </w:r>
-      <w:proofErr w:type="spellEnd"/>
-      <w:r>
-        <w:t xml:space="preserve"> </w:t>
-      </w:r>
-      <w:proofErr w:type="spellStart"/>
-      <w:r>
-        <w:t>của</w:t>
-      </w:r>
-      <w:proofErr w:type="spellEnd"/>
-      <w:r>
-        <w:t xml:space="preserve"> </w:t>
-      </w:r>
-      <w:proofErr w:type="spellStart"/>
-      <w:r>
-        <w:t>từ</w:t>
-      </w:r>
-      <w:proofErr w:type="spellEnd"/>
-      <w:r>
-        <w:t xml:space="preserve"> </w:t>
-      </w:r>
-      <w:proofErr w:type="spellStart"/>
-      <w:r>
-        <w:t>tạo</w:t>
-      </w:r>
-      <w:proofErr w:type="spellEnd"/>
-      <w:r>
-        <w:t xml:space="preserve"> </w:t>
-      </w:r>
-      <w:proofErr w:type="spellStart"/>
-      <w:r>
-        <w:t>mới</w:t>
-      </w:r>
-      <w:proofErr w:type="spellEnd"/>
+        <w:t>g: viết tắt của từ tạo mới</w:t>
+      </w:r>
     </w:p>
     <w:p>
       <w:pPr>
@@ -424,31 +208,7 @@
         </w:numPr>
       </w:pPr>
       <w:r>
-        <w:t xml:space="preserve">c: </w:t>
-      </w:r>
-      <w:proofErr w:type="spellStart"/>
-      <w:r>
-        <w:t>viết</w:t>
-      </w:r>
-      <w:proofErr w:type="spellEnd"/>
-      <w:r>
-        <w:t xml:space="preserve"> </w:t>
-      </w:r>
-      <w:proofErr w:type="spellStart"/>
-      <w:r>
-        <w:t>tắt</w:t>
-      </w:r>
-      <w:proofErr w:type="spellEnd"/>
-      <w:r>
-        <w:t xml:space="preserve"> </w:t>
-      </w:r>
-      <w:proofErr w:type="spellStart"/>
-      <w:r>
-        <w:t>của</w:t>
-      </w:r>
-      <w:proofErr w:type="spellEnd"/>
-      <w:r>
-        <w:t xml:space="preserve"> component</w:t>
+        <w:t>c: viết tắt của component</w:t>
       </w:r>
     </w:p>
     <w:p>
@@ -459,37 +219,8 @@
           <w:numId w:val="2"/>
         </w:numPr>
       </w:pPr>
-      <w:proofErr w:type="spellStart"/>
-      <w:r>
-        <w:t>componentName</w:t>
-      </w:r>
-      <w:proofErr w:type="spellEnd"/>
-      <w:r>
-        <w:t xml:space="preserve">: </w:t>
-      </w:r>
-      <w:proofErr w:type="spellStart"/>
-      <w:r>
-        <w:t>tên</w:t>
-      </w:r>
-      <w:proofErr w:type="spellEnd"/>
-      <w:r>
-        <w:t xml:space="preserve"> </w:t>
-      </w:r>
-      <w:proofErr w:type="spellStart"/>
-      <w:r>
-        <w:t>gọi</w:t>
-      </w:r>
-      <w:proofErr w:type="spellEnd"/>
-      <w:r>
-        <w:t xml:space="preserve"> </w:t>
-      </w:r>
-      <w:proofErr w:type="spellStart"/>
-      <w:r>
-        <w:t>của</w:t>
-      </w:r>
-      <w:proofErr w:type="spellEnd"/>
-      <w:r>
-        <w:t xml:space="preserve"> component</w:t>
+      <w:r>
+        <w:t>componentName: tên gọi của component</w:t>
       </w:r>
     </w:p>
     <w:p>
@@ -501,45 +232,8 @@
         </w:numPr>
       </w:pPr>
       <w:r>
-        <w:t xml:space="preserve">--skip-tests: </w:t>
-      </w:r>
-      <w:proofErr w:type="spellStart"/>
-      <w:r>
-        <w:t>loại</w:t>
-      </w:r>
-      <w:proofErr w:type="spellEnd"/>
-      <w:r>
-        <w:t xml:space="preserve"> </w:t>
-      </w:r>
-      <w:proofErr w:type="spellStart"/>
-      <w:r>
-        <w:t>bỏ</w:t>
-      </w:r>
-      <w:proofErr w:type="spellEnd"/>
-      <w:r>
-        <w:t xml:space="preserve"> file test </w:t>
-      </w:r>
-      <w:proofErr w:type="spellStart"/>
-      <w:r>
-        <w:t>khi</w:t>
-      </w:r>
-      <w:proofErr w:type="spellEnd"/>
-      <w:r>
-        <w:t xml:space="preserve"> </w:t>
-      </w:r>
-      <w:proofErr w:type="spellStart"/>
-      <w:r>
-        <w:t>tạo</w:t>
-      </w:r>
-      <w:proofErr w:type="spellEnd"/>
-      <w:r>
-        <w:t xml:space="preserve"> </w:t>
-      </w:r>
-      <w:proofErr w:type="spellStart"/>
-      <w:r>
-        <w:t>mới</w:t>
-      </w:r>
-      <w:proofErr w:type="spellEnd"/>
+        <w:t>--skip-tests: loại bỏ file test khi tạo mới</w:t>
+      </w:r>
     </w:p>
     <w:p>
       <w:pPr>
@@ -562,157 +256,60 @@
           <w:bCs/>
         </w:rPr>
       </w:pPr>
-      <w:proofErr w:type="spellStart"/>
       <w:r>
         <w:rPr>
           <w:b/>
           <w:bCs/>
         </w:rPr>
         <w:lastRenderedPageBreak/>
-        <w:t>Tạo</w:t>
-      </w:r>
-      <w:proofErr w:type="spellEnd"/>
-      <w:r>
+        <w:t>Tạo Service</w:t>
+      </w:r>
+    </w:p>
+    <w:p>
+      <w:r>
+        <w:t xml:space="preserve">Di chuyển tới thu mục chứa service: </w:t>
+      </w:r>
+      <w:r>
+        <w:rPr>
+          <w:highlight w:val="yellow"/>
+        </w:rPr>
+        <w:t>cd GUI/src/app/services/</w:t>
+      </w:r>
+      <w:r>
+        <w:rPr>
+          <w:highlight w:val="yellow"/>
+        </w:rPr>
+        <w:t>management</w:t>
+      </w:r>
+    </w:p>
+    <w:p>
+      <w:r>
+        <w:t xml:space="preserve">Vi du: </w:t>
+      </w:r>
+      <w:r>
+        <w:rPr>
+          <w:highlight w:val="yellow"/>
+        </w:rPr>
+        <w:t>cd GUI/src/app/services/training</w:t>
+      </w:r>
+    </w:p>
+    <w:p>
+      <w:pPr>
         <w:rPr>
           <w:b/>
           <w:bCs/>
         </w:rPr>
-        <w:t xml:space="preserve"> Service</w:t>
-      </w:r>
-    </w:p>
-    <w:p>
-      <w:r>
-        <w:t xml:space="preserve">Di </w:t>
-      </w:r>
-      <w:proofErr w:type="spellStart"/>
-      <w:r>
-        <w:t>chuyển</w:t>
-      </w:r>
-      <w:proofErr w:type="spellEnd"/>
-      <w:r>
-        <w:t xml:space="preserve"> </w:t>
-      </w:r>
-      <w:proofErr w:type="spellStart"/>
-      <w:r>
-        <w:t>tới</w:t>
-      </w:r>
-      <w:proofErr w:type="spellEnd"/>
-      <w:r>
-        <w:t xml:space="preserve"> </w:t>
-      </w:r>
-      <w:proofErr w:type="spellStart"/>
-      <w:r>
-        <w:t>thu</w:t>
-      </w:r>
-      <w:proofErr w:type="spellEnd"/>
-      <w:r>
-        <w:t xml:space="preserve"> </w:t>
-      </w:r>
-      <w:proofErr w:type="spellStart"/>
-      <w:r>
-        <w:t>mục</w:t>
-      </w:r>
-      <w:proofErr w:type="spellEnd"/>
-      <w:r>
-        <w:t xml:space="preserve"> </w:t>
-      </w:r>
-      <w:proofErr w:type="spellStart"/>
-      <w:r>
-        <w:t>chứa</w:t>
-      </w:r>
-      <w:proofErr w:type="spellEnd"/>
-      <w:r>
-        <w:t xml:space="preserve"> service: </w:t>
-      </w:r>
-      <w:r>
-        <w:rPr>
-          <w:highlight w:val="yellow"/>
-        </w:rPr>
-        <w:t>cd GUI/</w:t>
-      </w:r>
-      <w:proofErr w:type="spellStart"/>
-      <w:r>
-        <w:rPr>
-          <w:highlight w:val="yellow"/>
-        </w:rPr>
-        <w:t>src</w:t>
-      </w:r>
-      <w:proofErr w:type="spellEnd"/>
-      <w:r>
-        <w:rPr>
-          <w:highlight w:val="yellow"/>
-        </w:rPr>
-        <w:t>/app/services/</w:t>
-      </w:r>
-      <w:commentRangeStart w:id="0"/>
-      <w:r>
-        <w:rPr>
-          <w:highlight w:val="yellow"/>
-        </w:rPr>
-        <w:t>category</w:t>
-      </w:r>
-      <w:commentRangeEnd w:id="0"/>
-      <w:r>
-        <w:rPr>
-          <w:rStyle w:val="CommentReference"/>
-          <w:highlight w:val="yellow"/>
-        </w:rPr>
-        <w:commentReference w:id="0"/>
-      </w:r>
-    </w:p>
-    <w:p>
-      <w:r>
-        <w:t xml:space="preserve">Vi du: </w:t>
-      </w:r>
-      <w:r>
-        <w:rPr>
-          <w:highlight w:val="yellow"/>
-        </w:rPr>
-        <w:t>cd GUI/</w:t>
-      </w:r>
-      <w:proofErr w:type="spellStart"/>
-      <w:r>
-        <w:rPr>
-          <w:highlight w:val="yellow"/>
-        </w:rPr>
-        <w:t>src</w:t>
-      </w:r>
-      <w:proofErr w:type="spellEnd"/>
-      <w:r>
-        <w:rPr>
-          <w:highlight w:val="yellow"/>
-        </w:rPr>
-        <w:t>/app/services/</w:t>
-      </w:r>
-      <w:r>
-        <w:rPr>
-          <w:highlight w:val="yellow"/>
-        </w:rPr>
-        <w:t>training</w:t>
-      </w:r>
-    </w:p>
-    <w:p>
-      <w:pPr>
+      </w:pPr>
+      <w:r>
+        <w:t xml:space="preserve">Câu lệnh: </w:t>
+      </w:r>
+      <w:r>
         <w:rPr>
           <w:b/>
           <w:bCs/>
-        </w:rPr>
-      </w:pPr>
-      <w:proofErr w:type="spellStart"/>
-      <w:r>
-        <w:t>Câu</w:t>
-      </w:r>
-      <w:proofErr w:type="spellEnd"/>
-      <w:r>
-        <w:t xml:space="preserve"> </w:t>
-      </w:r>
-      <w:proofErr w:type="spellStart"/>
-      <w:r>
-        <w:t>lệnh</w:t>
-      </w:r>
-      <w:proofErr w:type="spellEnd"/>
-      <w:r>
-        <w:t xml:space="preserve">: </w:t>
+          <w:highlight w:val="yellow"/>
+        </w:rPr>
+        <w:t xml:space="preserve">ng g </w:t>
       </w:r>
       <w:r>
         <w:rPr>
@@ -720,7 +317,7 @@
           <w:bCs/>
           <w:highlight w:val="yellow"/>
         </w:rPr>
-        <w:t xml:space="preserve">ng g </w:t>
+        <w:t>s</w:t>
       </w:r>
       <w:r>
         <w:rPr>
@@ -728,7 +325,7 @@
           <w:bCs/>
           <w:highlight w:val="yellow"/>
         </w:rPr>
-        <w:t>s</w:t>
+        <w:t xml:space="preserve"> &lt;&lt;</w:t>
       </w:r>
       <w:r>
         <w:rPr>
@@ -736,16 +333,43 @@
           <w:bCs/>
           <w:highlight w:val="yellow"/>
         </w:rPr>
-        <w:t xml:space="preserve"> &lt;&lt;</w:t>
-      </w:r>
-      <w:proofErr w:type="spellStart"/>
+        <w:t>service</w:t>
+      </w:r>
       <w:r>
         <w:rPr>
           <w:b/>
           <w:bCs/>
           <w:highlight w:val="yellow"/>
         </w:rPr>
-        <w:t>service</w:t>
+        <w:t>Name&gt;&gt; --skip-tests</w:t>
+      </w:r>
+    </w:p>
+    <w:p>
+      <w:r>
+        <w:t>Câu lệnh đầy đủ: ng generate component &lt;&lt;serviceName&gt;&gt; --skip-tests</w:t>
+      </w:r>
+    </w:p>
+    <w:p>
+      <w:r>
+        <w:t xml:space="preserve">Ví dụ: </w:t>
+      </w:r>
+      <w:r>
+        <w:rPr>
+          <w:highlight w:val="yellow"/>
+        </w:rPr>
+        <w:t xml:space="preserve">ng g s </w:t>
+      </w:r>
+      <w:r>
+        <w:rPr>
+          <w:highlight w:val="yellow"/>
+        </w:rPr>
+        <w:t>parent</w:t>
+      </w:r>
+      <w:r>
+        <w:rPr>
+          <w:highlight w:val="yellow"/>
+        </w:rPr>
+        <w:t xml:space="preserve"> </w:t>
       </w:r>
       <w:r>
         <w:rPr>
@@ -753,111 +377,18 @@
           <w:bCs/>
           <w:highlight w:val="yellow"/>
         </w:rPr>
-        <w:t>Name</w:t>
-      </w:r>
-      <w:proofErr w:type="spellEnd"/>
-      <w:r>
-        <w:rPr>
-          <w:b/>
-          <w:bCs/>
-          <w:highlight w:val="yellow"/>
-        </w:rPr>
-        <w:t>&gt;&gt; --skip-tests</w:t>
-      </w:r>
-    </w:p>
-    <w:p>
-      <w:proofErr w:type="spellStart"/>
-      <w:r>
-        <w:t>Câu</w:t>
-      </w:r>
-      <w:proofErr w:type="spellEnd"/>
-      <w:r>
-        <w:t xml:space="preserve"> </w:t>
-      </w:r>
-      <w:proofErr w:type="spellStart"/>
-      <w:r>
-        <w:t>lệnh</w:t>
-      </w:r>
-      <w:proofErr w:type="spellEnd"/>
-      <w:r>
-        <w:t xml:space="preserve"> </w:t>
-      </w:r>
-      <w:proofErr w:type="spellStart"/>
-      <w:r>
-        <w:t>đầy</w:t>
-      </w:r>
-      <w:proofErr w:type="spellEnd"/>
-      <w:r>
-        <w:t xml:space="preserve"> </w:t>
-      </w:r>
-      <w:proofErr w:type="spellStart"/>
-      <w:r>
-        <w:t>đủ</w:t>
-      </w:r>
-      <w:proofErr w:type="spellEnd"/>
-      <w:r>
-        <w:t>: ng generate component &lt;&lt;</w:t>
-      </w:r>
-      <w:proofErr w:type="spellStart"/>
-      <w:r>
-        <w:t>serviceName</w:t>
-      </w:r>
-      <w:proofErr w:type="spellEnd"/>
-      <w:r>
-        <w:t>&gt;&gt; --skip-tests</w:t>
-      </w:r>
-    </w:p>
-    <w:p>
-      <w:proofErr w:type="spellStart"/>
-      <w:r>
-        <w:t>Ví</w:t>
-      </w:r>
-      <w:proofErr w:type="spellEnd"/>
-      <w:r>
-        <w:t xml:space="preserve"> </w:t>
-      </w:r>
-      <w:proofErr w:type="spellStart"/>
-      <w:r>
-        <w:t>dụ</w:t>
-      </w:r>
-      <w:proofErr w:type="spellEnd"/>
-      <w:r>
-        <w:t xml:space="preserve">: ng g s </w:t>
-      </w:r>
-      <w:r>
-        <w:t>course</w:t>
-      </w:r>
-      <w:r>
-        <w:t xml:space="preserve"> </w:t>
-      </w:r>
-      <w:r>
-        <w:rPr>
-          <w:b/>
-          <w:bCs/>
-          <w:highlight w:val="yellow"/>
-        </w:rPr>
         <w:t>--</w:t>
       </w:r>
       <w:r>
+        <w:rPr>
+          <w:highlight w:val="yellow"/>
+        </w:rPr>
         <w:t>skip-tests</w:t>
       </w:r>
     </w:p>
     <w:p>
-      <w:proofErr w:type="spellStart"/>
-      <w:r>
-        <w:t>Giải</w:t>
-      </w:r>
-      <w:proofErr w:type="spellEnd"/>
-      <w:r>
-        <w:t xml:space="preserve"> </w:t>
-      </w:r>
-      <w:proofErr w:type="spellStart"/>
-      <w:r>
-        <w:t>thích</w:t>
-      </w:r>
-      <w:proofErr w:type="spellEnd"/>
-      <w:r>
-        <w:t>:</w:t>
+      <w:r>
+        <w:t>Giải thích:</w:t>
       </w:r>
     </w:p>
     <w:p>
@@ -869,39 +400,7 @@
         </w:numPr>
       </w:pPr>
       <w:r>
-        <w:t xml:space="preserve">ng: </w:t>
-      </w:r>
-      <w:proofErr w:type="spellStart"/>
-      <w:r>
-        <w:t>câu</w:t>
-      </w:r>
-      <w:proofErr w:type="spellEnd"/>
-      <w:r>
-        <w:t xml:space="preserve"> </w:t>
-      </w:r>
-      <w:proofErr w:type="spellStart"/>
-      <w:r>
-        <w:t>lệnh</w:t>
-      </w:r>
-      <w:proofErr w:type="spellEnd"/>
-      <w:r>
-        <w:t xml:space="preserve"> </w:t>
-      </w:r>
-      <w:proofErr w:type="spellStart"/>
-      <w:r>
-        <w:t>gọi</w:t>
-      </w:r>
-      <w:proofErr w:type="spellEnd"/>
-      <w:r>
-        <w:t xml:space="preserve"> </w:t>
-      </w:r>
-      <w:proofErr w:type="spellStart"/>
-      <w:r>
-        <w:t>đến</w:t>
-      </w:r>
-      <w:proofErr w:type="spellEnd"/>
-      <w:r>
-        <w:t xml:space="preserve"> Angular</w:t>
+        <w:t>ng: câu lệnh gọi đến Angular</w:t>
       </w:r>
     </w:p>
     <w:p>
@@ -913,53 +412,8 @@
         </w:numPr>
       </w:pPr>
       <w:r>
-        <w:t xml:space="preserve">g: </w:t>
-      </w:r>
-      <w:proofErr w:type="spellStart"/>
-      <w:r>
-        <w:t>viết</w:t>
-      </w:r>
-      <w:proofErr w:type="spellEnd"/>
-      <w:r>
-        <w:t xml:space="preserve"> </w:t>
-      </w:r>
-      <w:proofErr w:type="spellStart"/>
-      <w:r>
-        <w:t>tắt</w:t>
-      </w:r>
-      <w:proofErr w:type="spellEnd"/>
-      <w:r>
-        <w:t xml:space="preserve"> </w:t>
-      </w:r>
-      <w:proofErr w:type="spellStart"/>
-      <w:r>
-        <w:t>của</w:t>
-      </w:r>
-      <w:proofErr w:type="spellEnd"/>
-      <w:r>
-        <w:t xml:space="preserve"> </w:t>
-      </w:r>
-      <w:proofErr w:type="spellStart"/>
-      <w:r>
-        <w:t>từ</w:t>
-      </w:r>
-      <w:proofErr w:type="spellEnd"/>
-      <w:r>
-        <w:t xml:space="preserve"> </w:t>
-      </w:r>
-      <w:proofErr w:type="spellStart"/>
-      <w:r>
-        <w:t>tạo</w:t>
-      </w:r>
-      <w:proofErr w:type="spellEnd"/>
-      <w:r>
-        <w:t xml:space="preserve"> </w:t>
-      </w:r>
-      <w:proofErr w:type="spellStart"/>
-      <w:r>
-        <w:t>mới</w:t>
-      </w:r>
-      <w:proofErr w:type="spellEnd"/>
+        <w:t>g: viết tắt của từ tạo mới</w:t>
+      </w:r>
     </w:p>
     <w:p>
       <w:pPr>
@@ -970,31 +424,7 @@
         </w:numPr>
       </w:pPr>
       <w:r>
-        <w:t xml:space="preserve">s: </w:t>
-      </w:r>
-      <w:proofErr w:type="spellStart"/>
-      <w:r>
-        <w:t>viết</w:t>
-      </w:r>
-      <w:proofErr w:type="spellEnd"/>
-      <w:r>
-        <w:t xml:space="preserve"> </w:t>
-      </w:r>
-      <w:proofErr w:type="spellStart"/>
-      <w:r>
-        <w:t>tắt</w:t>
-      </w:r>
-      <w:proofErr w:type="spellEnd"/>
-      <w:r>
-        <w:t xml:space="preserve"> </w:t>
-      </w:r>
-      <w:proofErr w:type="spellStart"/>
-      <w:r>
-        <w:t>của</w:t>
-      </w:r>
-      <w:proofErr w:type="spellEnd"/>
-      <w:r>
-        <w:t xml:space="preserve"> service</w:t>
+        <w:t>s: viết tắt của service</w:t>
       </w:r>
     </w:p>
     <w:p>
@@ -1005,37 +435,8 @@
           <w:numId w:val="2"/>
         </w:numPr>
       </w:pPr>
-      <w:proofErr w:type="spellStart"/>
-      <w:r>
-        <w:t>serviceName</w:t>
-      </w:r>
-      <w:proofErr w:type="spellEnd"/>
-      <w:r>
-        <w:t xml:space="preserve">: </w:t>
-      </w:r>
-      <w:proofErr w:type="spellStart"/>
-      <w:r>
-        <w:t>tên</w:t>
-      </w:r>
-      <w:proofErr w:type="spellEnd"/>
-      <w:r>
-        <w:t xml:space="preserve"> </w:t>
-      </w:r>
-      <w:proofErr w:type="spellStart"/>
-      <w:r>
-        <w:t>gọi</w:t>
-      </w:r>
-      <w:proofErr w:type="spellEnd"/>
-      <w:r>
-        <w:t xml:space="preserve"> </w:t>
-      </w:r>
-      <w:proofErr w:type="spellStart"/>
-      <w:r>
-        <w:t>của</w:t>
-      </w:r>
-      <w:proofErr w:type="spellEnd"/>
-      <w:r>
-        <w:t xml:space="preserve"> service</w:t>
+      <w:r>
+        <w:t>serviceName: tên gọi của service</w:t>
       </w:r>
     </w:p>
     <w:p>
@@ -1047,45 +448,8 @@
         </w:numPr>
       </w:pPr>
       <w:r>
-        <w:t xml:space="preserve">--skip-tests: </w:t>
-      </w:r>
-      <w:proofErr w:type="spellStart"/>
-      <w:r>
-        <w:t>loại</w:t>
-      </w:r>
-      <w:proofErr w:type="spellEnd"/>
-      <w:r>
-        <w:t xml:space="preserve"> </w:t>
-      </w:r>
-      <w:proofErr w:type="spellStart"/>
-      <w:r>
-        <w:t>bỏ</w:t>
-      </w:r>
-      <w:proofErr w:type="spellEnd"/>
-      <w:r>
-        <w:t xml:space="preserve"> file test </w:t>
-      </w:r>
-      <w:proofErr w:type="spellStart"/>
-      <w:r>
-        <w:t>khi</w:t>
-      </w:r>
-      <w:proofErr w:type="spellEnd"/>
-      <w:r>
-        <w:t xml:space="preserve"> </w:t>
-      </w:r>
-      <w:proofErr w:type="spellStart"/>
-      <w:r>
-        <w:t>tạo</w:t>
-      </w:r>
-      <w:proofErr w:type="spellEnd"/>
-      <w:r>
-        <w:t xml:space="preserve"> </w:t>
-      </w:r>
-      <w:proofErr w:type="spellStart"/>
-      <w:r>
-        <w:t>mới</w:t>
-      </w:r>
-      <w:proofErr w:type="spellEnd"/>
+        <w:t>--skip-tests: loại bỏ file test khi tạo mới</w:t>
+      </w:r>
     </w:p>
     <w:p/>
     <w:sectPr>
@@ -1096,82 +460,6 @@
     </w:sectPr>
   </w:body>
 </w:document>
-</file>
-
-<file path=word/comments.xml><?xml version="1.0" encoding="utf-8"?>
-<w:comments xmlns:wpc="http://schemas.microsoft.com/office/word/2010/wordprocessingCanvas" xmlns:cx="http://schemas.microsoft.com/office/drawing/2014/chartex" xmlns:cx1="http://schemas.microsoft.com/office/drawing/2015/9/8/chartex" xmlns:cx2="http://schemas.microsoft.com/office/drawing/2015/10/21/chartex" xmlns:cx3="http://schemas.microsoft.com/office/drawing/2016/5/9/chartex" xmlns:cx4="http://schemas.microsoft.com/office/drawing/2016/5/10/chartex" xmlns:cx5="http://schemas.microsoft.com/office/drawing/2016/5/11/chartex" xmlns:cx6="http://schemas.microsoft.com/office/drawing/2016/5/12/chartex" xmlns:cx7="http://schemas.microsoft.com/office/drawing/2016/5/13/chartex" xmlns:cx8="http://schemas.microsoft.com/office/drawing/2016/5/14/chartex" xmlns:mc="http://schemas.openxmlformats.org/markup-compatibility/2006" xmlns:aink="http://schemas.microsoft.com/office/drawing/2016/ink" xmlns:am3d="http://schemas.microsoft.com/office/drawing/2017/model3d" xmlns:o="urn:schemas-microsoft-com:office:office" xmlns:oel="http://schemas.microsoft.com/office/2019/extlst" xmlns:r="http://schemas.openxmlformats.org/officeDocument/2006/relationships" xmlns:m="http://schemas.openxmlformats.org/officeDocument/2006/math" xmlns:v="urn:schemas-microsoft-com:vml" xmlns:wp14="http://schemas.microsoft.com/office/word/2010/wordprocessingDrawing" xmlns:wp="http://schemas.openxmlformats.org/drawingml/2006/wordprocessingDrawing" xmlns:w10="urn:schemas-microsoft-com:office:word" xmlns:w="http://schemas.openxmlformats.org/wordprocessingml/2006/main" xmlns:w14="http://schemas.microsoft.com/office/word/2010/wordml" xmlns:w15="http://schemas.microsoft.com/office/word/2012/wordml" xmlns:w16cex="http://schemas.microsoft.com/office/word/2018/wordml/cex" xmlns:w16cid="http://schemas.microsoft.com/office/word/2016/wordml/cid" xmlns:w16="http://schemas.microsoft.com/office/word/2018/wordml" xmlns:w16du="http://schemas.microsoft.com/office/word/2023/wordml/word16du" xmlns:w16sdtdh="http://schemas.microsoft.com/office/word/2020/wordml/sdtdatahash" xmlns:w16se="http://schemas.microsoft.com/office/word/2015/wordml/symex" xmlns:wpg="http://schemas.microsoft.com/office/word/2010/wordprocessingGroup" xmlns:wpi="http://schemas.microsoft.com/office/word/2010/wordprocessingInk" xmlns:wne="http://schemas.microsoft.com/office/word/2006/wordml" xmlns:wps="http://schemas.microsoft.com/office/word/2010/wordprocessingShape" mc:Ignorable="w14 w15 w16se w16cid w16 w16cex w16sdtdh w16du wp14">
-  <w:comment w:id="0" w:author="Trí Cường Nguyễn" w:date="2024-10-03T10:04:00Z" w:initials="TN">
-    <w:p>
-      <w:pPr>
-        <w:pStyle w:val="CommentText"/>
-      </w:pPr>
-      <w:r>
-        <w:rPr>
-          <w:rStyle w:val="CommentReference"/>
-        </w:rPr>
-        <w:annotationRef/>
-      </w:r>
-      <w:r>
-        <w:t xml:space="preserve">Thay </w:t>
-      </w:r>
-      <w:proofErr w:type="spellStart"/>
-      <w:r>
-        <w:t>th</w:t>
-      </w:r>
-      <w:proofErr w:type="spellEnd"/>
-      <w:r>
-        <w:rPr>
-          <w:lang w:val="vi-VN"/>
-        </w:rPr>
-        <w:t>ế bằng t</w:t>
-      </w:r>
-      <w:r>
-        <w:t>ê</w:t>
-      </w:r>
-      <w:r>
-        <w:rPr>
-          <w:lang w:val="vi-VN"/>
-        </w:rPr>
-        <w:t xml:space="preserve">n thư mục chung (category, system, </w:t>
-      </w:r>
-      <w:proofErr w:type="gramStart"/>
-      <w:r>
-        <w:rPr>
-          <w:lang w:val="vi-VN"/>
-        </w:rPr>
-        <w:t>teach,</w:t>
-      </w:r>
-      <w:r>
-        <w:t>…</w:t>
-      </w:r>
-      <w:proofErr w:type="gramEnd"/>
-      <w:r>
-        <w:rPr>
-          <w:lang w:val="vi-VN"/>
-        </w:rPr>
-        <w:t>)</w:t>
-      </w:r>
-    </w:p>
-  </w:comment>
-</w:comments>
-</file>
-
-<file path=word/commentsExtended.xml><?xml version="1.0" encoding="utf-8"?>
-<w15:commentsEx xmlns:wpc="http://schemas.microsoft.com/office/word/2010/wordprocessingCanvas" xmlns:cx="http://schemas.microsoft.com/office/drawing/2014/chartex" xmlns:cx1="http://schemas.microsoft.com/office/drawing/2015/9/8/chartex" xmlns:cx2="http://schemas.microsoft.com/office/drawing/2015/10/21/chartex" xmlns:cx3="http://schemas.microsoft.com/office/drawing/2016/5/9/chartex" xmlns:cx4="http://schemas.microsoft.com/office/drawing/2016/5/10/chartex" xmlns:cx5="http://schemas.microsoft.com/office/drawing/2016/5/11/chartex" xmlns:cx6="http://schemas.microsoft.com/office/drawing/2016/5/12/chartex" xmlns:cx7="http://schemas.microsoft.com/office/drawing/2016/5/13/chartex" xmlns:cx8="http://schemas.microsoft.com/office/drawing/2016/5/14/chartex" xmlns:mc="http://schemas.openxmlformats.org/markup-compatibility/2006" xmlns:aink="http://schemas.microsoft.com/office/drawing/2016/ink" xmlns:am3d="http://schemas.microsoft.com/office/drawing/2017/model3d" xmlns:o="urn:schemas-microsoft-com:office:office" xmlns:oel="http://schemas.microsoft.com/office/2019/extlst" xmlns:r="http://schemas.openxmlformats.org/officeDocument/2006/relationships" xmlns:m="http://schemas.openxmlformats.org/officeDocument/2006/math" xmlns:v="urn:schemas-microsoft-com:vml" xmlns:wp14="http://schemas.microsoft.com/office/word/2010/wordprocessingDrawing" xmlns:wp="http://schemas.openxmlformats.org/drawingml/2006/wordprocessingDrawing" xmlns:w10="urn:schemas-microsoft-com:office:word" xmlns:w="http://schemas.openxmlformats.org/wordprocessingml/2006/main" xmlns:w14="http://schemas.microsoft.com/office/word/2010/wordml" xmlns:w15="http://schemas.microsoft.com/office/word/2012/wordml" xmlns:w16cex="http://schemas.microsoft.com/office/word/2018/wordml/cex" xmlns:w16cid="http://schemas.microsoft.com/office/word/2016/wordml/cid" xmlns:w16="http://schemas.microsoft.com/office/word/2018/wordml" xmlns:w16du="http://schemas.microsoft.com/office/word/2023/wordml/word16du" xmlns:w16sdtdh="http://schemas.microsoft.com/office/word/2020/wordml/sdtdatahash" xmlns:w16se="http://schemas.microsoft.com/office/word/2015/wordml/symex" xmlns:wpg="http://schemas.microsoft.com/office/word/2010/wordprocessingGroup" xmlns:wpi="http://schemas.microsoft.com/office/word/2010/wordprocessingInk" xmlns:wne="http://schemas.microsoft.com/office/word/2006/wordml" xmlns:wps="http://schemas.microsoft.com/office/word/2010/wordprocessingShape" mc:Ignorable="w14 w15 w16se w16cid w16 w16cex w16sdtdh w16du wp14">
-  <w15:commentEx w15:paraId="2A033690" w15:done="0"/>
-</w15:commentsEx>
-</file>
-
-<file path=word/commentsExtensible.xml><?xml version="1.0" encoding="utf-8"?>
-<w16cex:commentsExtensible xmlns:wpc="http://schemas.microsoft.com/office/word/2010/wordprocessingCanvas" xmlns:cx="http://schemas.microsoft.com/office/drawing/2014/chartex" xmlns:cx1="http://schemas.microsoft.com/office/drawing/2015/9/8/chartex" xmlns:cx2="http://schemas.microsoft.com/office/drawing/2015/10/21/chartex" xmlns:cx3="http://schemas.microsoft.com/office/drawing/2016/5/9/chartex" xmlns:cx4="http://schemas.microsoft.com/office/drawing/2016/5/10/chartex" xmlns:cx5="http://schemas.microsoft.com/office/drawing/2016/5/11/chartex" xmlns:cx6="http://schemas.microsoft.com/office/drawing/2016/5/12/chartex" xmlns:cx7="http://schemas.microsoft.com/office/drawing/2016/5/13/chartex" xmlns:cx8="http://schemas.microsoft.com/office/drawing/2016/5/14/chartex" xmlns:cr="http://schemas.microsoft.com/office/comments/2020/reactions" xmlns:mc="http://schemas.openxmlformats.org/markup-compatibility/2006" xmlns:aink="http://schemas.microsoft.com/office/drawing/2016/ink" xmlns:am3d="http://schemas.microsoft.com/office/drawing/2017/model3d" xmlns:o="urn:schemas-microsoft-com:office:office" xmlns:oel="http://schemas.microsoft.com/office/2019/extlst" xmlns:r="http://schemas.openxmlformats.org/officeDocument/2006/relationships" xmlns:m="http://schemas.openxmlformats.org/officeDocument/2006/math" xmlns:v="urn:schemas-microsoft-com:vml" xmlns:wp14="http://schemas.microsoft.com/office/word/2010/wordprocessingDrawing" xmlns:wp="http://schemas.openxmlformats.org/drawingml/2006/wordprocessingDrawing" xmlns:w10="urn:schemas-microsoft-com:office:word" xmlns:w="http://schemas.openxmlformats.org/wordprocessingml/2006/main" xmlns:w14="http://schemas.microsoft.com/office/word/2010/wordml" xmlns:w15="http://schemas.microsoft.com/office/word/2012/wordml" xmlns:w16cex="http://schemas.microsoft.com/office/word/2018/wordml/cex" xmlns:w16cid="http://schemas.microsoft.com/office/word/2016/wordml/cid" xmlns:w16="http://schemas.microsoft.com/office/word/2018/wordml" xmlns:w16du="http://schemas.microsoft.com/office/word/2023/wordml/word16du" xmlns:w16sdtdh="http://schemas.microsoft.com/office/word/2020/wordml/sdtdatahash" xmlns:w16se="http://schemas.microsoft.com/office/word/2015/wordml/symex" xmlns:wpg="http://schemas.microsoft.com/office/word/2010/wordprocessingGroup" xmlns:wpi="http://schemas.microsoft.com/office/word/2010/wordprocessingInk" xmlns:wne="http://schemas.microsoft.com/office/word/2006/wordml" xmlns:wps="http://schemas.microsoft.com/office/word/2010/wordprocessingShape" mc:Ignorable="w14 w15 w16se w16cid w16 w16cex w16sdtdh cr w16du wp14">
-  <w16cex:commentExtensible w16cex:durableId="47AC57A3" w16cex:dateUtc="2024-10-03T03:04:00Z"/>
-</w16cex:commentsExtensible>
-</file>
-
-<file path=word/commentsIds.xml><?xml version="1.0" encoding="utf-8"?>
-<w16cid:commentsIds xmlns:wpc="http://schemas.microsoft.com/office/word/2010/wordprocessingCanvas" xmlns:cx="http://schemas.microsoft.com/office/drawing/2014/chartex" xmlns:cx1="http://schemas.microsoft.com/office/drawing/2015/9/8/chartex" xmlns:cx2="http://schemas.microsoft.com/office/drawing/2015/10/21/chartex" xmlns:cx3="http://schemas.microsoft.com/office/drawing/2016/5/9/chartex" xmlns:cx4="http://schemas.microsoft.com/office/drawing/2016/5/10/chartex" xmlns:cx5="http://schemas.microsoft.com/office/drawing/2016/5/11/chartex" xmlns:cx6="http://schemas.microsoft.com/office/drawing/2016/5/12/chartex" xmlns:cx7="http://schemas.microsoft.com/office/drawing/2016/5/13/chartex" xmlns:cx8="http://schemas.microsoft.com/office/drawing/2016/5/14/chartex" xmlns:mc="http://schemas.openxmlformats.org/markup-compatibility/2006" xmlns:aink="http://schemas.microsoft.com/office/drawing/2016/ink" xmlns:am3d="http://schemas.microsoft.com/office/drawing/2017/model3d" xmlns:o="urn:schemas-microsoft-com:office:office" xmlns:oel="http://schemas.microsoft.com/office/2019/extlst" xmlns:r="http://schemas.openxmlformats.org/officeDocument/2006/relationships" xmlns:m="http://schemas.openxmlformats.org/officeDocument/2006/math" xmlns:v="urn:schemas-microsoft-com:vml" xmlns:wp14="http://schemas.microsoft.com/office/word/2010/wordprocessingDrawing" xmlns:wp="http://schemas.openxmlformats.org/drawingml/2006/wordprocessingDrawing" xmlns:w10="urn:schemas-microsoft-com:office:word" xmlns:w="http://schemas.openxmlformats.org/wordprocessingml/2006/main" xmlns:w14="http://schemas.microsoft.com/office/word/2010/wordml" xmlns:w15="http://schemas.microsoft.com/office/word/2012/wordml" xmlns:w16cex="http://schemas.microsoft.com/office/word/2018/wordml/cex" xmlns:w16cid="http://schemas.microsoft.com/office/word/2016/wordml/cid" xmlns:w16="http://schemas.microsoft.com/office/word/2018/wordml" xmlns:w16du="http://schemas.microsoft.com/office/word/2023/wordml/word16du" xmlns:w16sdtdh="http://schemas.microsoft.com/office/word/2020/wordml/sdtdatahash" xmlns:w16se="http://schemas.microsoft.com/office/word/2015/wordml/symex" xmlns:wpg="http://schemas.microsoft.com/office/word/2010/wordprocessingGroup" xmlns:wpi="http://schemas.microsoft.com/office/word/2010/wordprocessingInk" xmlns:wne="http://schemas.microsoft.com/office/word/2006/wordml" xmlns:wps="http://schemas.microsoft.com/office/word/2010/wordprocessingShape" mc:Ignorable="w14 w15 w16se w16cid w16 w16cex w16sdtdh w16du wp14">
-  <w16cid:commentId w16cid:paraId="2A033690" w16cid:durableId="47AC57A3"/>
-</w16cid:commentsIds>
 </file>
 
 <file path=word/numbering.xml><?xml version="1.0" encoding="utf-8"?>
@@ -1385,14 +673,6 @@
     <w:abstractNumId w:val="1"/>
   </w:num>
 </w:numbering>
-</file>
-
-<file path=word/people.xml><?xml version="1.0" encoding="utf-8"?>
-<w15:people xmlns:wpc="http://schemas.microsoft.com/office/word/2010/wordprocessingCanvas" xmlns:cx="http://schemas.microsoft.com/office/drawing/2014/chartex" xmlns:cx1="http://schemas.microsoft.com/office/drawing/2015/9/8/chartex" xmlns:cx2="http://schemas.microsoft.com/office/drawing/2015/10/21/chartex" xmlns:cx3="http://schemas.microsoft.com/office/drawing/2016/5/9/chartex" xmlns:cx4="http://schemas.microsoft.com/office/drawing/2016/5/10/chartex" xmlns:cx5="http://schemas.microsoft.com/office/drawing/2016/5/11/chartex" xmlns:cx6="http://schemas.microsoft.com/office/drawing/2016/5/12/chartex" xmlns:cx7="http://schemas.microsoft.com/office/drawing/2016/5/13/chartex" xmlns:cx8="http://schemas.microsoft.com/office/drawing/2016/5/14/chartex" xmlns:mc="http://schemas.openxmlformats.org/markup-compatibility/2006" xmlns:aink="http://schemas.microsoft.com/office/drawing/2016/ink" xmlns:am3d="http://schemas.microsoft.com/office/drawing/2017/model3d" xmlns:o="urn:schemas-microsoft-com:office:office" xmlns:oel="http://schemas.microsoft.com/office/2019/extlst" xmlns:r="http://schemas.openxmlformats.org/officeDocument/2006/relationships" xmlns:m="http://schemas.openxmlformats.org/officeDocument/2006/math" xmlns:v="urn:schemas-microsoft-com:vml" xmlns:wp14="http://schemas.microsoft.com/office/word/2010/wordprocessingDrawing" xmlns:wp="http://schemas.openxmlformats.org/drawingml/2006/wordprocessingDrawing" xmlns:w10="urn:schemas-microsoft-com:office:word" xmlns:w="http://schemas.openxmlformats.org/wordprocessingml/2006/main" xmlns:w14="http://schemas.microsoft.com/office/word/2010/wordml" xmlns:w15="http://schemas.microsoft.com/office/word/2012/wordml" xmlns:w16cex="http://schemas.microsoft.com/office/word/2018/wordml/cex" xmlns:w16cid="http://schemas.microsoft.com/office/word/2016/wordml/cid" xmlns:w16="http://schemas.microsoft.com/office/word/2018/wordml" xmlns:w16du="http://schemas.microsoft.com/office/word/2023/wordml/word16du" xmlns:w16sdtdh="http://schemas.microsoft.com/office/word/2020/wordml/sdtdatahash" xmlns:w16se="http://schemas.microsoft.com/office/word/2015/wordml/symex" xmlns:wpg="http://schemas.microsoft.com/office/word/2010/wordprocessingGroup" xmlns:wpi="http://schemas.microsoft.com/office/word/2010/wordprocessingInk" xmlns:wne="http://schemas.microsoft.com/office/word/2006/wordml" xmlns:wps="http://schemas.microsoft.com/office/word/2010/wordprocessingShape" mc:Ignorable="w14 w15 w16se w16cid w16 w16cex w16sdtdh w16du wp14">
-  <w15:person w15:author="Trí Cường Nguyễn">
-    <w15:presenceInfo w15:providerId="Windows Live" w15:userId="4850bbb478d2d752"/>
-  </w15:person>
-</w15:people>
 </file>
 
 <file path=word/styles.xml><?xml version="1.0" encoding="utf-8"?>

</xml_diff>